<commit_message>
docs(readme) >> I removed the OFX file from the documents and organized them.
</commit_message>
<xml_diff>
--- a/Documentação/2 - Requisitos/V1.0.4/Documento de Requisitos V1.0.4.docx
+++ b/Documentação/2 - Requisitos/V1.0.4/Documento de Requisitos V1.0.4.docx
@@ -28,7 +28,6 @@
         </w:rPr>
         <w:t xml:space="preserve">Documento de Especificação de Requisitos – </w:t>
       </w:r>
-      <w:proofErr w:type="spellStart"/>
       <w:r>
         <w:rPr>
           <w:rFonts w:ascii="Times New Roman" w:eastAsia="Times New Roman" w:hAnsi="Times New Roman" w:cs="Times New Roman"/>
@@ -41,7 +40,6 @@
         </w:rPr>
         <w:t>Monevo</w:t>
       </w:r>
-      <w:proofErr w:type="spellEnd"/>
     </w:p>
     <w:p>
       <w:pPr>
@@ -976,7 +974,6 @@
         </w:rPr>
         <w:t xml:space="preserve">O presente documento tem como objetivo especificar, de forma clara e detalhada, todos os requisitos funcionais e não funcionais do sistema </w:t>
       </w:r>
-      <w:proofErr w:type="spellStart"/>
       <w:r>
         <w:rPr>
           <w:rStyle w:val="Forte"/>
@@ -985,7 +982,6 @@
         </w:rPr>
         <w:t>Monevo</w:t>
       </w:r>
-      <w:proofErr w:type="spellEnd"/>
       <w:r>
         <w:rPr>
           <w:rFonts w:ascii="Times New Roman" w:hAnsi="Times New Roman" w:cs="Times New Roman"/>
@@ -1041,7 +1037,6 @@
       <w:r>
         <w:t xml:space="preserve">O sistema </w:t>
       </w:r>
-      <w:proofErr w:type="spellStart"/>
       <w:r>
         <w:rPr>
           <w:b/>
@@ -1049,7 +1044,6 @@
         </w:rPr>
         <w:t>Monevo</w:t>
       </w:r>
-      <w:proofErr w:type="spellEnd"/>
       <w:r>
         <w:t xml:space="preserve"> tem como principal finalidade atuar como um gestor de finanças pessoais, com o propósito de otimizar e simplificar o controle financeiro do usuário. Além das funcionalidades voltadas ao gerenciamento monetário, o sistema incorporará recursos de educação financeira, apresentados de maneira objetiva e não massiva, visando estimular boas práticas e auxiliar na tomada de decisões econômicas.</w:t>
       </w:r>
@@ -1249,7 +1243,6 @@
         </w:rPr>
         <w:t xml:space="preserve">SIGLA: </w:t>
       </w:r>
-      <w:proofErr w:type="spellStart"/>
       <w:r>
         <w:rPr>
           <w:rFonts w:ascii="Times New Roman" w:eastAsia="Times New Roman" w:hAnsi="Times New Roman" w:cs="Times New Roman"/>
@@ -1257,7 +1250,6 @@
         </w:rPr>
         <w:t>Monevo</w:t>
       </w:r>
-      <w:proofErr w:type="spellEnd"/>
       <w:r>
         <w:rPr>
           <w:rFonts w:ascii="Times New Roman" w:eastAsia="Times New Roman" w:hAnsi="Times New Roman" w:cs="Times New Roman"/>
@@ -1508,51 +1500,15 @@
           <w:color w:val="1B1C1D"/>
           <w:sz w:val="24"/>
         </w:rPr>
-        <w:t>na parte de Back-</w:t>
-      </w:r>
-      <w:proofErr w:type="spellStart"/>
+        <w:t xml:space="preserve">na parte de Back-end </w:t>
+      </w:r>
       <w:r>
         <w:rPr>
           <w:rFonts w:ascii="Times New Roman" w:eastAsia="Times New Roman" w:hAnsi="Times New Roman" w:cs="Times New Roman"/>
           <w:color w:val="1B1C1D"/>
           <w:sz w:val="24"/>
         </w:rPr>
-        <w:t>end</w:t>
-      </w:r>
-      <w:proofErr w:type="spellEnd"/>
-      <w:r>
-        <w:rPr>
-          <w:rFonts w:ascii="Times New Roman" w:eastAsia="Times New Roman" w:hAnsi="Times New Roman" w:cs="Times New Roman"/>
-          <w:color w:val="1B1C1D"/>
-          <w:sz w:val="24"/>
-        </w:rPr>
-        <w:t xml:space="preserve"> </w:t>
-      </w:r>
-      <w:r>
-        <w:rPr>
-          <w:rFonts w:ascii="Times New Roman" w:eastAsia="Times New Roman" w:hAnsi="Times New Roman" w:cs="Times New Roman"/>
-          <w:color w:val="1B1C1D"/>
-          <w:sz w:val="24"/>
-        </w:rPr>
-        <w:t xml:space="preserve">em Python 3.x com o framework </w:t>
-      </w:r>
-      <w:proofErr w:type="spellStart"/>
-      <w:r>
-        <w:rPr>
-          <w:rFonts w:ascii="Times New Roman" w:eastAsia="Times New Roman" w:hAnsi="Times New Roman" w:cs="Times New Roman"/>
-          <w:color w:val="1B1C1D"/>
-          <w:sz w:val="24"/>
-        </w:rPr>
-        <w:t>Flask</w:t>
-      </w:r>
-      <w:proofErr w:type="spellEnd"/>
-      <w:r>
-        <w:rPr>
-          <w:rFonts w:ascii="Times New Roman" w:eastAsia="Times New Roman" w:hAnsi="Times New Roman" w:cs="Times New Roman"/>
-          <w:color w:val="1B1C1D"/>
-          <w:sz w:val="24"/>
-        </w:rPr>
-        <w:t>.</w:t>
+        <w:t>em Python 3.x com o framework Flask.</w:t>
       </w:r>
     </w:p>
     <w:p>
@@ -1584,25 +1540,23 @@
           <w:color w:val="1B1C1D"/>
           <w:sz w:val="24"/>
         </w:rPr>
-        <w:t>na parte de Front-</w:t>
-      </w:r>
-      <w:proofErr w:type="spellStart"/>
+        <w:t xml:space="preserve">na parte de Front-end </w:t>
+      </w:r>
       <w:r>
         <w:rPr>
           <w:rFonts w:ascii="Times New Roman" w:eastAsia="Times New Roman" w:hAnsi="Times New Roman" w:cs="Times New Roman"/>
           <w:color w:val="1B1C1D"/>
           <w:sz w:val="24"/>
         </w:rPr>
-        <w:t>end</w:t>
-      </w:r>
-      <w:proofErr w:type="spellEnd"/>
+        <w:t xml:space="preserve">em </w:t>
+      </w:r>
       <w:r>
         <w:rPr>
           <w:rFonts w:ascii="Times New Roman" w:eastAsia="Times New Roman" w:hAnsi="Times New Roman" w:cs="Times New Roman"/>
           <w:color w:val="1B1C1D"/>
           <w:sz w:val="24"/>
         </w:rPr>
-        <w:t xml:space="preserve"> </w:t>
+        <w:t>Html 5, Css 3 e JavaScript</w:t>
       </w:r>
       <w:r>
         <w:rPr>
@@ -1610,80 +1564,24 @@
           <w:color w:val="1B1C1D"/>
           <w:sz w:val="24"/>
         </w:rPr>
-        <w:t xml:space="preserve">em </w:t>
-      </w:r>
-      <w:proofErr w:type="spellStart"/>
+        <w:t xml:space="preserve"> com o framework </w:t>
+      </w:r>
       <w:r>
         <w:rPr>
           <w:rFonts w:ascii="Times New Roman" w:eastAsia="Times New Roman" w:hAnsi="Times New Roman" w:cs="Times New Roman"/>
           <w:color w:val="1B1C1D"/>
           <w:sz w:val="24"/>
         </w:rPr>
-        <w:t>Html</w:t>
-      </w:r>
-      <w:proofErr w:type="spellEnd"/>
+        <w:t>B</w:t>
+      </w:r>
       <w:r>
         <w:rPr>
           <w:rFonts w:ascii="Times New Roman" w:eastAsia="Times New Roman" w:hAnsi="Times New Roman" w:cs="Times New Roman"/>
           <w:color w:val="1B1C1D"/>
           <w:sz w:val="24"/>
         </w:rPr>
-        <w:t xml:space="preserve"> 5, </w:t>
-      </w:r>
-      <w:proofErr w:type="spellStart"/>
-      <w:r>
-        <w:rPr>
-          <w:rFonts w:ascii="Times New Roman" w:eastAsia="Times New Roman" w:hAnsi="Times New Roman" w:cs="Times New Roman"/>
-          <w:color w:val="1B1C1D"/>
-          <w:sz w:val="24"/>
-        </w:rPr>
-        <w:t>Css</w:t>
-      </w:r>
-      <w:proofErr w:type="spellEnd"/>
-      <w:r>
-        <w:rPr>
-          <w:rFonts w:ascii="Times New Roman" w:eastAsia="Times New Roman" w:hAnsi="Times New Roman" w:cs="Times New Roman"/>
-          <w:color w:val="1B1C1D"/>
-          <w:sz w:val="24"/>
-        </w:rPr>
-        <w:t xml:space="preserve"> 3 e </w:t>
-      </w:r>
-      <w:proofErr w:type="spellStart"/>
-      <w:r>
-        <w:rPr>
-          <w:rFonts w:ascii="Times New Roman" w:eastAsia="Times New Roman" w:hAnsi="Times New Roman" w:cs="Times New Roman"/>
-          <w:color w:val="1B1C1D"/>
-          <w:sz w:val="24"/>
-        </w:rPr>
-        <w:t>JavaScript</w:t>
-      </w:r>
-      <w:proofErr w:type="spellEnd"/>
-      <w:r>
-        <w:rPr>
-          <w:rFonts w:ascii="Times New Roman" w:eastAsia="Times New Roman" w:hAnsi="Times New Roman" w:cs="Times New Roman"/>
-          <w:color w:val="1B1C1D"/>
-          <w:sz w:val="24"/>
-        </w:rPr>
-        <w:t xml:space="preserve"> com o framework </w:t>
-      </w:r>
-      <w:proofErr w:type="spellStart"/>
-      <w:r>
-        <w:rPr>
-          <w:rFonts w:ascii="Times New Roman" w:eastAsia="Times New Roman" w:hAnsi="Times New Roman" w:cs="Times New Roman"/>
-          <w:color w:val="1B1C1D"/>
-          <w:sz w:val="24"/>
-        </w:rPr>
-        <w:t>B</w:t>
-      </w:r>
-      <w:r>
-        <w:rPr>
-          <w:rFonts w:ascii="Times New Roman" w:eastAsia="Times New Roman" w:hAnsi="Times New Roman" w:cs="Times New Roman"/>
-          <w:color w:val="1B1C1D"/>
-          <w:sz w:val="24"/>
-        </w:rPr>
         <w:t>ootstrap</w:t>
       </w:r>
-      <w:proofErr w:type="spellEnd"/>
       <w:r>
         <w:rPr>
           <w:rFonts w:ascii="Times New Roman" w:eastAsia="Times New Roman" w:hAnsi="Times New Roman" w:cs="Times New Roman"/>
@@ -1716,16 +1614,22 @@
         </w:rPr>
         <w:t xml:space="preserve">O banco de dados deve ser </w:t>
       </w:r>
-      <w:proofErr w:type="spellStart"/>
       <w:r>
         <w:rPr>
           <w:rFonts w:ascii="Times New Roman" w:eastAsia="Times New Roman" w:hAnsi="Times New Roman" w:cs="Times New Roman"/>
           <w:color w:val="1B1C1D"/>
           <w:sz w:val="24"/>
         </w:rPr>
-        <w:t>SQLite</w:t>
-      </w:r>
-      <w:proofErr w:type="spellEnd"/>
+        <w:t>P</w:t>
+      </w:r>
+      <w:r>
+        <w:rPr>
+          <w:rFonts w:ascii="Times New Roman" w:eastAsia="Times New Roman" w:hAnsi="Times New Roman" w:cs="Times New Roman"/>
+          <w:color w:val="1B1C1D"/>
+          <w:sz w:val="24"/>
+        </w:rPr>
+        <w:t>ostgresql</w:t>
+      </w:r>
       <w:r>
         <w:rPr>
           <w:rFonts w:ascii="Times New Roman" w:eastAsia="Times New Roman" w:hAnsi="Times New Roman" w:cs="Times New Roman"/>
@@ -1756,31 +1660,15 @@
           <w:color w:val="1B1C1D"/>
           <w:sz w:val="24"/>
         </w:rPr>
-        <w:t>A interface deve ser responsiva e compatível com navegadores modernos (Chrome, Edge e Firefox).</w:t>
-      </w:r>
-    </w:p>
-    <w:p>
-      <w:pPr>
-        <w:numPr>
-          <w:ilvl w:val="0"/>
-          <w:numId w:val="20"/>
-        </w:numPr>
-        <w:spacing w:after="0" w:line="240" w:lineRule="auto"/>
-        <w:jc w:val="both"/>
-        <w:outlineLvl w:val="3"/>
+        <w:t>A interface deve ser responsiva e compatível com navegadores modernos (Chrome, Edge e Firefox)</w:t>
+      </w:r>
+      <w:r>
         <w:rPr>
           <w:rFonts w:ascii="Times New Roman" w:eastAsia="Times New Roman" w:hAnsi="Times New Roman" w:cs="Times New Roman"/>
           <w:color w:val="1B1C1D"/>
           <w:sz w:val="24"/>
         </w:rPr>
-      </w:pPr>
-      <w:r>
-        <w:rPr>
-          <w:rFonts w:ascii="Times New Roman" w:eastAsia="Times New Roman" w:hAnsi="Times New Roman" w:cs="Times New Roman"/>
-          <w:color w:val="1B1C1D"/>
-          <w:sz w:val="24"/>
-        </w:rPr>
-        <w:t>O sistema deve permitir integração com arquivos OFX para importação de dados bancários.</w:t>
+        <w:t>.</w:t>
       </w:r>
     </w:p>
     <w:p>
@@ -1895,25 +1783,7 @@
           <w:color w:val="1B1C1D"/>
           <w:sz w:val="24"/>
         </w:rPr>
-        <w:t xml:space="preserve">Deve utilizar a identidade visual definida para o produto </w:t>
-      </w:r>
-      <w:proofErr w:type="spellStart"/>
-      <w:r>
-        <w:rPr>
-          <w:rFonts w:ascii="Times New Roman" w:eastAsia="Times New Roman" w:hAnsi="Times New Roman" w:cs="Times New Roman"/>
-          <w:color w:val="1B1C1D"/>
-          <w:sz w:val="24"/>
-        </w:rPr>
-        <w:t>Monevo</w:t>
-      </w:r>
-      <w:proofErr w:type="spellEnd"/>
-      <w:r>
-        <w:rPr>
-          <w:rFonts w:ascii="Times New Roman" w:eastAsia="Times New Roman" w:hAnsi="Times New Roman" w:cs="Times New Roman"/>
-          <w:color w:val="1B1C1D"/>
-          <w:sz w:val="24"/>
-        </w:rPr>
-        <w:t xml:space="preserve"> (cores, logotipo e tipografia).</w:t>
+        <w:t>Deve utilizar a identidade visual definida para o produto Monevo (cores, logotipo e tipografia).</w:t>
       </w:r>
     </w:p>
     <w:p>
@@ -2265,7 +2135,7 @@
           <w:color w:val="1B1C1D"/>
           <w:sz w:val="24"/>
         </w:rPr>
-        <w:t>Assume-se que os arquivos OFX de importação seguirão o padrão definido pelas instituições financeiras.</w:t>
+        <w:t>Assume-se que os navegadores utilizados pelos usuários estarão atualizados para garantir compatibilidade.</w:t>
       </w:r>
     </w:p>
     <w:p>
@@ -2289,31 +2159,6 @@
           <w:color w:val="1B1C1D"/>
           <w:sz w:val="24"/>
         </w:rPr>
-        <w:t>Assume-se que os navegadores utilizados pelos usuários estarão atualizados para garantir compatibilidade.</w:t>
-      </w:r>
-    </w:p>
-    <w:p>
-      <w:pPr>
-        <w:numPr>
-          <w:ilvl w:val="0"/>
-          <w:numId w:val="23"/>
-        </w:numPr>
-        <w:spacing w:after="0" w:line="240" w:lineRule="auto"/>
-        <w:jc w:val="both"/>
-        <w:outlineLvl w:val="3"/>
-        <w:rPr>
-          <w:rFonts w:ascii="Times New Roman" w:eastAsia="Times New Roman" w:hAnsi="Times New Roman" w:cs="Times New Roman"/>
-          <w:color w:val="1B1C1D"/>
-          <w:sz w:val="24"/>
-        </w:rPr>
-      </w:pPr>
-      <w:r>
-        <w:rPr>
-          <w:rFonts w:ascii="Times New Roman" w:eastAsia="Times New Roman" w:hAnsi="Times New Roman" w:cs="Times New Roman"/>
-          <w:color w:val="1B1C1D"/>
-          <w:sz w:val="24"/>
-        </w:rPr>
-        <w:lastRenderedPageBreak/>
         <w:t>Assume-se que os servidores de hospedagem permanecerão disponíveis durante o uso do sistema.</w:t>
       </w:r>
     </w:p>
@@ -2400,18 +2245,25 @@
           <w:color w:val="1B1C1D"/>
           <w:sz w:val="24"/>
         </w:rPr>
+        <w:lastRenderedPageBreak/>
         <w:t xml:space="preserve">Disponibilidade do servidor de banco de dados </w:t>
       </w:r>
-      <w:proofErr w:type="spellStart"/>
       <w:r>
         <w:rPr>
           <w:rFonts w:ascii="Times New Roman" w:eastAsia="Times New Roman" w:hAnsi="Times New Roman" w:cs="Times New Roman"/>
           <w:color w:val="1B1C1D"/>
           <w:sz w:val="24"/>
         </w:rPr>
-        <w:t>SQLite</w:t>
-      </w:r>
-      <w:proofErr w:type="spellEnd"/>
+        <w:t>P</w:t>
+      </w:r>
+      <w:r>
+        <w:rPr>
+          <w:rFonts w:ascii="Times New Roman" w:eastAsia="Times New Roman" w:hAnsi="Times New Roman" w:cs="Times New Roman"/>
+          <w:color w:val="1B1C1D"/>
+          <w:sz w:val="24"/>
+        </w:rPr>
+        <w:t>ostgresql</w:t>
+      </w:r>
       <w:r>
         <w:rPr>
           <w:rFonts w:ascii="Times New Roman" w:eastAsia="Times New Roman" w:hAnsi="Times New Roman" w:cs="Times New Roman"/>
@@ -2466,43 +2318,7 @@
           <w:color w:val="1B1C1D"/>
           <w:sz w:val="24"/>
         </w:rPr>
-        <w:t>Disponibilidade das bibliotecas e frameworks de desenvolvimento utilizados (</w:t>
-      </w:r>
-      <w:proofErr w:type="spellStart"/>
-      <w:r>
-        <w:rPr>
-          <w:rFonts w:ascii="Times New Roman" w:eastAsia="Times New Roman" w:hAnsi="Times New Roman" w:cs="Times New Roman"/>
-          <w:color w:val="1B1C1D"/>
-          <w:sz w:val="24"/>
-        </w:rPr>
-        <w:t>Flask</w:t>
-      </w:r>
-      <w:proofErr w:type="spellEnd"/>
-      <w:r>
-        <w:rPr>
-          <w:rFonts w:ascii="Times New Roman" w:eastAsia="Times New Roman" w:hAnsi="Times New Roman" w:cs="Times New Roman"/>
-          <w:color w:val="1B1C1D"/>
-          <w:sz w:val="24"/>
-        </w:rPr>
-        <w:t xml:space="preserve">, </w:t>
-      </w:r>
-      <w:proofErr w:type="spellStart"/>
-      <w:r>
-        <w:rPr>
-          <w:rFonts w:ascii="Times New Roman" w:eastAsia="Times New Roman" w:hAnsi="Times New Roman" w:cs="Times New Roman"/>
-          <w:color w:val="1B1C1D"/>
-          <w:sz w:val="24"/>
-        </w:rPr>
-        <w:t>Bootstrap</w:t>
-      </w:r>
-      <w:proofErr w:type="spellEnd"/>
-      <w:r>
-        <w:rPr>
-          <w:rFonts w:ascii="Times New Roman" w:eastAsia="Times New Roman" w:hAnsi="Times New Roman" w:cs="Times New Roman"/>
-          <w:color w:val="1B1C1D"/>
-          <w:sz w:val="24"/>
-        </w:rPr>
-        <w:t>).</w:t>
+        <w:t>Disponibilidade das bibliotecas e frameworks de desenvolvimento utilizados (Flask, Bootstrap).</w:t>
       </w:r>
     </w:p>
     <w:p>
@@ -3810,7 +3626,7 @@
                 <w:color w:val="auto"/>
                 <w:sz w:val="24"/>
               </w:rPr>
-              <w:t>4</w:t>
+              <w:t>3</w:t>
             </w:r>
             <w:r>
               <w:rPr>
@@ -3853,7 +3669,7 @@
                 <w:bCs/>
                 <w:sz w:val="23"/>
               </w:rPr>
-              <w:t>5</w:t>
+              <w:t>4</w:t>
             </w:r>
             <w:r>
               <w:rPr>
@@ -3899,815 +3715,18 @@
       <w:tblPr>
         <w:tblStyle w:val="TableGrid"/>
         <w:tblW w:w="10497" w:type="dxa"/>
-        <w:tblInd w:w="-851" w:type="dxa"/>
+        <w:tblInd w:w="-855" w:type="dxa"/>
+        <w:tblCellMar>
+          <w:top w:w="10" w:type="dxa"/>
+          <w:left w:w="68" w:type="dxa"/>
+          <w:right w:w="115" w:type="dxa"/>
+        </w:tblCellMar>
         <w:tblLook w:val="04A0" w:firstRow="1" w:lastRow="0" w:firstColumn="1" w:lastColumn="0" w:noHBand="0" w:noVBand="1"/>
       </w:tblPr>
       <w:tblGrid>
         <w:gridCol w:w="10497"/>
       </w:tblGrid>
       <w:tr>
-        <w:trPr>
-          <w:trHeight w:val="10469"/>
-        </w:trPr>
-        <w:tc>
-          <w:tcPr>
-            <w:tcW w:w="10497" w:type="dxa"/>
-          </w:tcPr>
-          <w:tbl>
-            <w:tblPr>
-              <w:tblStyle w:val="Tabelacomgrade"/>
-              <w:tblW w:w="10467" w:type="dxa"/>
-              <w:tblLook w:val="04A0" w:firstRow="1" w:lastRow="0" w:firstColumn="1" w:lastColumn="0" w:noHBand="0" w:noVBand="1"/>
-            </w:tblPr>
-            <w:tblGrid>
-              <w:gridCol w:w="10467"/>
-            </w:tblGrid>
-            <w:tr>
-              <w:trPr>
-                <w:trHeight w:val="11899"/>
-              </w:trPr>
-              <w:tc>
-                <w:tcPr>
-                  <w:tcW w:w="10467" w:type="dxa"/>
-                </w:tcPr>
-                <w:p>
-                  <w:pPr>
-                    <w:jc w:val="both"/>
-                    <w:rPr>
-                      <w:rFonts w:ascii="Times New Roman" w:eastAsia="Times New Roman" w:hAnsi="Times New Roman" w:cs="Times New Roman"/>
-                      <w:b/>
-                      <w:bCs/>
-                      <w:color w:val="1B1C1D"/>
-                      <w:sz w:val="24"/>
-                      <w:bdr w:val="none" w:sz="0" w:space="0" w:color="auto" w:frame="1"/>
-                    </w:rPr>
-                  </w:pPr>
-                  <w:r>
-                    <w:rPr>
-                      <w:rFonts w:ascii="Times New Roman" w:eastAsia="Times New Roman" w:hAnsi="Times New Roman" w:cs="Times New Roman"/>
-                      <w:b/>
-                      <w:sz w:val="24"/>
-                    </w:rPr>
-                    <w:lastRenderedPageBreak/>
-                    <w:br/>
-                  </w:r>
-                  <w:r>
-                    <w:rPr>
-                      <w:rFonts w:ascii="Times New Roman" w:eastAsia="Times New Roman" w:hAnsi="Times New Roman" w:cs="Times New Roman"/>
-                      <w:b/>
-                      <w:sz w:val="24"/>
-                    </w:rPr>
-                    <w:t>Código Requisito</w:t>
-                  </w:r>
-                  <w:r>
-                    <w:rPr>
-                      <w:rFonts w:ascii="Times New Roman" w:eastAsia="Times New Roman" w:hAnsi="Times New Roman" w:cs="Times New Roman"/>
-                      <w:sz w:val="24"/>
-                    </w:rPr>
-                    <w:t xml:space="preserve">: # </w:t>
-                  </w:r>
-                  <w:r>
-                    <w:rPr>
-                      <w:rFonts w:ascii="Times New Roman" w:eastAsia="Times New Roman" w:hAnsi="Times New Roman" w:cs="Times New Roman"/>
-                      <w:b/>
-                      <w:sz w:val="24"/>
-                    </w:rPr>
-                    <w:t>RF0</w:t>
-                  </w:r>
-                  <w:r>
-                    <w:rPr>
-                      <w:rFonts w:ascii="Times New Roman" w:eastAsia="Times New Roman" w:hAnsi="Times New Roman" w:cs="Times New Roman"/>
-                      <w:b/>
-                      <w:sz w:val="24"/>
-                    </w:rPr>
-                    <w:t xml:space="preserve">2 - </w:t>
-                  </w:r>
-                  <w:r>
-                    <w:rPr>
-                      <w:rFonts w:ascii="Times New Roman" w:eastAsia="Times New Roman" w:hAnsi="Times New Roman" w:cs="Times New Roman"/>
-                      <w:b/>
-                      <w:bCs/>
-                      <w:color w:val="1B1C1D"/>
-                      <w:sz w:val="24"/>
-                      <w:bdr w:val="none" w:sz="0" w:space="0" w:color="auto" w:frame="1"/>
-                    </w:rPr>
-                    <w:t>Importação de Extrato Bancário</w:t>
-                  </w:r>
-                </w:p>
-                <w:p>
-                  <w:pPr>
-                    <w:jc w:val="both"/>
-                    <w:rPr>
-                      <w:rFonts w:ascii="Times New Roman" w:eastAsia="Times New Roman" w:hAnsi="Times New Roman" w:cs="Times New Roman"/>
-                      <w:sz w:val="24"/>
-                    </w:rPr>
-                  </w:pPr>
-                  <w:r>
-                    <w:rPr>
-                      <w:rFonts w:ascii="Times New Roman" w:eastAsia="Times New Roman" w:hAnsi="Times New Roman" w:cs="Times New Roman"/>
-                      <w:sz w:val="24"/>
-                    </w:rPr>
-                    <w:t xml:space="preserve">  </w:t>
-                  </w:r>
-                </w:p>
-                <w:p>
-                  <w:pPr>
-                    <w:jc w:val="both"/>
-                    <w:rPr>
-                      <w:rFonts w:ascii="Times New Roman" w:hAnsi="Times New Roman" w:cs="Times New Roman"/>
-                      <w:sz w:val="24"/>
-                    </w:rPr>
-                  </w:pPr>
-                  <w:r>
-                    <w:rPr>
-                      <w:rFonts w:ascii="Times New Roman" w:eastAsia="Times New Roman" w:hAnsi="Times New Roman" w:cs="Times New Roman"/>
-                      <w:b/>
-                      <w:sz w:val="24"/>
-                    </w:rPr>
-                    <w:t>Prioridade</w:t>
-                  </w:r>
-                  <w:r>
-                    <w:rPr>
-                      <w:rFonts w:ascii="Times New Roman" w:eastAsia="Times New Roman" w:hAnsi="Times New Roman" w:cs="Times New Roman"/>
-                      <w:sz w:val="24"/>
-                    </w:rPr>
-                    <w:t xml:space="preserve">: </w:t>
-                  </w:r>
-                  <w:r>
-                    <w:rPr>
-                      <w:rFonts w:ascii="Times New Roman" w:eastAsia="Times New Roman" w:hAnsi="Times New Roman" w:cs="Times New Roman"/>
-                      <w:sz w:val="24"/>
-                    </w:rPr>
-                    <w:t>Importante</w:t>
-                  </w:r>
-                </w:p>
-                <w:p>
-                  <w:pPr>
-                    <w:jc w:val="both"/>
-                    <w:rPr>
-                      <w:rFonts w:ascii="Times New Roman" w:hAnsi="Times New Roman" w:cs="Times New Roman"/>
-                      <w:sz w:val="24"/>
-                    </w:rPr>
-                  </w:pPr>
-                  <w:r>
-                    <w:rPr>
-                      <w:rFonts w:ascii="Times New Roman" w:eastAsia="Times New Roman" w:hAnsi="Times New Roman" w:cs="Times New Roman"/>
-                      <w:sz w:val="24"/>
-                    </w:rPr>
-                    <w:t xml:space="preserve"> </w:t>
-                  </w:r>
-                </w:p>
-                <w:p>
-                  <w:pPr>
-                    <w:spacing w:after="23"/>
-                    <w:ind w:left="117"/>
-                    <w:jc w:val="both"/>
-                    <w:rPr>
-                      <w:rFonts w:ascii="Times New Roman" w:hAnsi="Times New Roman" w:cs="Times New Roman"/>
-                      <w:sz w:val="24"/>
-                    </w:rPr>
-                  </w:pPr>
-                  <w:r>
-                    <w:rPr>
-                      <w:rFonts w:ascii="Times New Roman" w:eastAsia="Times New Roman" w:hAnsi="Times New Roman" w:cs="Times New Roman"/>
-                      <w:b/>
-                      <w:sz w:val="24"/>
-                    </w:rPr>
-                    <w:t>Descrição</w:t>
-                  </w:r>
-                  <w:r>
-                    <w:rPr>
-                      <w:rFonts w:ascii="Times New Roman" w:eastAsia="Times New Roman" w:hAnsi="Times New Roman" w:cs="Times New Roman"/>
-                      <w:sz w:val="24"/>
-                    </w:rPr>
-                    <w:t xml:space="preserve">:  </w:t>
-                  </w:r>
-                </w:p>
-                <w:p>
-                  <w:pPr>
-                    <w:jc w:val="both"/>
-                    <w:rPr>
-                      <w:rFonts w:ascii="Times New Roman" w:eastAsia="Times New Roman" w:hAnsi="Times New Roman" w:cs="Times New Roman"/>
-                      <w:sz w:val="24"/>
-                    </w:rPr>
-                  </w:pPr>
-                  <w:r>
-                    <w:rPr>
-                      <w:rFonts w:ascii="Times New Roman" w:eastAsia="Times New Roman" w:hAnsi="Times New Roman" w:cs="Times New Roman"/>
-                      <w:sz w:val="24"/>
-                    </w:rPr>
-                    <w:t xml:space="preserve">   </w:t>
-                  </w:r>
-                  <w:r>
-                    <w:rPr>
-                      <w:rFonts w:ascii="Times New Roman" w:eastAsia="Times New Roman" w:hAnsi="Times New Roman" w:cs="Times New Roman"/>
-                      <w:sz w:val="24"/>
-                    </w:rPr>
-                    <w:t>O usuário poderá importar extratos bancários em formato OFX. Para isso, selecionará e enviará o arquivo, que será processado pelo sistema. O sistema realizará a leitura e registro das transações como receitas e despesas, validará o arquivo, identificará erros, detectará transações duplicadas e tentará associar automaticamente as movimentações a categorias.</w:t>
-                  </w:r>
-                </w:p>
-                <w:p>
-                  <w:pPr>
-                    <w:jc w:val="both"/>
-                    <w:rPr>
-                      <w:rFonts w:ascii="Times New Roman" w:eastAsia="Times New Roman" w:hAnsi="Times New Roman" w:cs="Times New Roman"/>
-                      <w:sz w:val="24"/>
-                    </w:rPr>
-                  </w:pPr>
-                  <w:r>
-                    <w:rPr>
-                      <w:rFonts w:ascii="Times New Roman" w:eastAsia="Times New Roman" w:hAnsi="Times New Roman" w:cs="Times New Roman"/>
-                      <w:sz w:val="24"/>
-                    </w:rPr>
-                    <w:t xml:space="preserve">Ao final, o usuário será notificado sobre o sucesso da importação e poderá visualizar os </w:t>
-                  </w:r>
-                  <w:r>
-                    <w:rPr>
-                      <w:rFonts w:ascii="Times New Roman" w:eastAsia="Times New Roman" w:hAnsi="Times New Roman" w:cs="Times New Roman"/>
-                      <w:sz w:val="24"/>
-                    </w:rPr>
-                    <w:t>lançamentos importados, com destaque para aqueles que necessitem categorização manual.</w:t>
-                  </w:r>
-                </w:p>
-                <w:p>
-                  <w:pPr>
-                    <w:jc w:val="both"/>
-                    <w:rPr>
-                      <w:rFonts w:ascii="Times New Roman" w:hAnsi="Times New Roman" w:cs="Times New Roman"/>
-                      <w:sz w:val="24"/>
-                    </w:rPr>
-                  </w:pPr>
-                </w:p>
-                <w:p>
-                  <w:pPr>
-                    <w:spacing w:after="23"/>
-                    <w:ind w:left="117"/>
-                    <w:jc w:val="both"/>
-                    <w:rPr>
-                      <w:rFonts w:ascii="Times New Roman" w:hAnsi="Times New Roman" w:cs="Times New Roman"/>
-                      <w:sz w:val="24"/>
-                    </w:rPr>
-                  </w:pPr>
-                  <w:r>
-                    <w:rPr>
-                      <w:rFonts w:ascii="Times New Roman" w:eastAsia="Times New Roman" w:hAnsi="Times New Roman" w:cs="Times New Roman"/>
-                      <w:b/>
-                      <w:sz w:val="24"/>
-                    </w:rPr>
-                    <w:t>Justificativa</w:t>
-                  </w:r>
-                  <w:r>
-                    <w:rPr>
-                      <w:rFonts w:ascii="Times New Roman" w:eastAsia="Times New Roman" w:hAnsi="Times New Roman" w:cs="Times New Roman"/>
-                      <w:sz w:val="24"/>
-                    </w:rPr>
-                    <w:t xml:space="preserve">:  </w:t>
-                  </w:r>
-                </w:p>
-                <w:p>
-                  <w:pPr>
-                    <w:jc w:val="both"/>
-                    <w:rPr>
-                      <w:rFonts w:ascii="Times New Roman" w:eastAsia="Times New Roman" w:hAnsi="Times New Roman" w:cs="Times New Roman"/>
-                      <w:sz w:val="24"/>
-                    </w:rPr>
-                  </w:pPr>
-                  <w:r>
-                    <w:rPr>
-                      <w:rFonts w:ascii="Times New Roman" w:eastAsia="Times New Roman" w:hAnsi="Times New Roman" w:cs="Times New Roman"/>
-                      <w:sz w:val="24"/>
-                    </w:rPr>
-                    <w:t xml:space="preserve">   </w:t>
-                  </w:r>
-                  <w:r>
-                    <w:rPr>
-                      <w:rFonts w:ascii="Times New Roman" w:eastAsia="Times New Roman" w:hAnsi="Times New Roman" w:cs="Times New Roman"/>
-                      <w:sz w:val="24"/>
-                    </w:rPr>
-                    <w:t>A importação de extratos bancários em formato OFX permite ao usuário economizar tempo e reduzir erros de digitação ao registrar manualmente suas transações. Essa funcionalidade contribui para um controle financeiro mais ágil, seguro e confiável.</w:t>
-                  </w:r>
-                </w:p>
-                <w:p>
-                  <w:pPr>
-                    <w:jc w:val="both"/>
-                    <w:rPr>
-                      <w:rFonts w:ascii="Times New Roman" w:hAnsi="Times New Roman" w:cs="Times New Roman"/>
-                      <w:sz w:val="24"/>
-                    </w:rPr>
-                  </w:pPr>
-                </w:p>
-                <w:p>
-                  <w:pPr>
-                    <w:spacing w:after="23"/>
-                    <w:ind w:left="117"/>
-                    <w:jc w:val="both"/>
-                    <w:rPr>
-                      <w:rFonts w:ascii="Times New Roman" w:hAnsi="Times New Roman" w:cs="Times New Roman"/>
-                      <w:sz w:val="24"/>
-                    </w:rPr>
-                  </w:pPr>
-                  <w:r>
-                    <w:rPr>
-                      <w:rFonts w:ascii="Times New Roman" w:eastAsia="Times New Roman" w:hAnsi="Times New Roman" w:cs="Times New Roman"/>
-                      <w:b/>
-                      <w:sz w:val="24"/>
-                    </w:rPr>
-                    <w:t>Origem</w:t>
-                  </w:r>
-                  <w:r>
-                    <w:rPr>
-                      <w:rFonts w:ascii="Times New Roman" w:eastAsia="Times New Roman" w:hAnsi="Times New Roman" w:cs="Times New Roman"/>
-                      <w:sz w:val="24"/>
-                    </w:rPr>
-                    <w:t xml:space="preserve">:  </w:t>
-                  </w:r>
-                </w:p>
-                <w:p>
-                  <w:pPr>
-                    <w:jc w:val="both"/>
-                    <w:rPr>
-                      <w:rFonts w:ascii="Times New Roman" w:eastAsia="Times New Roman" w:hAnsi="Times New Roman" w:cs="Times New Roman"/>
-                      <w:color w:val="auto"/>
-                      <w:sz w:val="24"/>
-                    </w:rPr>
-                  </w:pPr>
-                  <w:r>
-                    <w:rPr>
-                      <w:rFonts w:ascii="Times New Roman" w:eastAsia="Times New Roman" w:hAnsi="Times New Roman" w:cs="Times New Roman"/>
-                      <w:color w:val="auto"/>
-                      <w:sz w:val="24"/>
-                    </w:rPr>
-                    <w:t xml:space="preserve">    Solicitação do cliente (Usuário final do sistema de gestão financeira pessoal).  </w:t>
-                  </w:r>
-                </w:p>
-                <w:p>
-                  <w:pPr>
-                    <w:jc w:val="both"/>
-                    <w:rPr>
-                      <w:rFonts w:ascii="Times New Roman" w:hAnsi="Times New Roman" w:cs="Times New Roman"/>
-                      <w:color w:val="auto"/>
-                      <w:sz w:val="24"/>
-                    </w:rPr>
-                  </w:pPr>
-                  <w:r>
-                    <w:rPr>
-                      <w:rFonts w:ascii="Times New Roman" w:eastAsia="Times New Roman" w:hAnsi="Times New Roman" w:cs="Times New Roman"/>
-                      <w:color w:val="auto"/>
-                      <w:sz w:val="24"/>
-                    </w:rPr>
-                    <w:t xml:space="preserve"> </w:t>
-                  </w:r>
-                </w:p>
-                <w:p>
-                  <w:pPr>
-                    <w:spacing w:after="24"/>
-                    <w:ind w:left="117"/>
-                    <w:jc w:val="both"/>
-                    <w:rPr>
-                      <w:rFonts w:ascii="Times New Roman" w:hAnsi="Times New Roman" w:cs="Times New Roman"/>
-                      <w:sz w:val="24"/>
-                    </w:rPr>
-                  </w:pPr>
-                  <w:r>
-                    <w:rPr>
-                      <w:rFonts w:ascii="Times New Roman" w:eastAsia="Times New Roman" w:hAnsi="Times New Roman" w:cs="Times New Roman"/>
-                      <w:b/>
-                      <w:sz w:val="24"/>
-                    </w:rPr>
-                    <w:t xml:space="preserve">Critério de Verificação: </w:t>
-                  </w:r>
-                </w:p>
-                <w:p>
-                  <w:pPr>
-                    <w:pStyle w:val="PargrafodaLista"/>
-                    <w:spacing w:after="24"/>
-                    <w:ind w:left="837"/>
-                    <w:jc w:val="both"/>
-                    <w:rPr>
-                      <w:rFonts w:ascii="Times New Roman" w:hAnsi="Times New Roman" w:cs="Times New Roman"/>
-                      <w:sz w:val="24"/>
-                    </w:rPr>
-                  </w:pPr>
-                </w:p>
-                <w:p>
-                  <w:pPr>
-                    <w:pStyle w:val="PargrafodaLista"/>
-                    <w:numPr>
-                      <w:ilvl w:val="0"/>
-                      <w:numId w:val="10"/>
-                    </w:numPr>
-                    <w:spacing w:line="239" w:lineRule="auto"/>
-                    <w:jc w:val="both"/>
-                    <w:rPr>
-                      <w:rFonts w:ascii="Times New Roman" w:hAnsi="Times New Roman" w:cs="Times New Roman"/>
-                      <w:color w:val="auto"/>
-                      <w:sz w:val="24"/>
-                    </w:rPr>
-                  </w:pPr>
-                  <w:r>
-                    <w:rPr>
-                      <w:rFonts w:ascii="Times New Roman" w:hAnsi="Times New Roman" w:cs="Times New Roman"/>
-                      <w:color w:val="auto"/>
-                      <w:sz w:val="24"/>
-                    </w:rPr>
-                    <w:t>Testar a importação de um arquivo OFX válido e verificar se as transações aparecem corretamente no sistema.</w:t>
-                  </w:r>
-                </w:p>
-                <w:p>
-                  <w:pPr>
-                    <w:pStyle w:val="PargrafodaLista"/>
-                    <w:numPr>
-                      <w:ilvl w:val="0"/>
-                      <w:numId w:val="10"/>
-                    </w:numPr>
-                    <w:spacing w:line="239" w:lineRule="auto"/>
-                    <w:jc w:val="both"/>
-                    <w:rPr>
-                      <w:rFonts w:ascii="Times New Roman" w:hAnsi="Times New Roman" w:cs="Times New Roman"/>
-                      <w:color w:val="auto"/>
-                      <w:sz w:val="24"/>
-                    </w:rPr>
-                  </w:pPr>
-                  <w:r>
-                    <w:rPr>
-                      <w:rFonts w:ascii="Times New Roman" w:hAnsi="Times New Roman" w:cs="Times New Roman"/>
-                      <w:color w:val="auto"/>
-                      <w:sz w:val="24"/>
-                    </w:rPr>
-                    <w:t>Confirmar se transações duplicadas são detectadas e bloqueadas.</w:t>
-                  </w:r>
-                </w:p>
-                <w:p>
-                  <w:pPr>
-                    <w:pStyle w:val="PargrafodaLista"/>
-                    <w:numPr>
-                      <w:ilvl w:val="0"/>
-                      <w:numId w:val="10"/>
-                    </w:numPr>
-                    <w:spacing w:line="239" w:lineRule="auto"/>
-                    <w:jc w:val="both"/>
-                    <w:rPr>
-                      <w:rFonts w:ascii="Times New Roman" w:hAnsi="Times New Roman" w:cs="Times New Roman"/>
-                      <w:color w:val="auto"/>
-                      <w:sz w:val="24"/>
-                    </w:rPr>
-                  </w:pPr>
-                  <w:r>
-                    <w:rPr>
-                      <w:rFonts w:ascii="Times New Roman" w:hAnsi="Times New Roman" w:cs="Times New Roman"/>
-                      <w:color w:val="auto"/>
-                      <w:sz w:val="24"/>
-                    </w:rPr>
-                    <w:t>Verificar se o sistema apresenta erro ao tentar importar arquivo em formato diferente de OFX.</w:t>
-                  </w:r>
-                </w:p>
-                <w:p>
-                  <w:pPr>
-                    <w:pStyle w:val="PargrafodaLista"/>
-                    <w:numPr>
-                      <w:ilvl w:val="0"/>
-                      <w:numId w:val="10"/>
-                    </w:numPr>
-                    <w:spacing w:line="239" w:lineRule="auto"/>
-                    <w:jc w:val="both"/>
-                    <w:rPr>
-                      <w:rFonts w:ascii="Times New Roman" w:hAnsi="Times New Roman" w:cs="Times New Roman"/>
-                      <w:color w:val="auto"/>
-                      <w:sz w:val="24"/>
-                    </w:rPr>
-                  </w:pPr>
-                  <w:r>
-                    <w:rPr>
-                      <w:rFonts w:ascii="Times New Roman" w:hAnsi="Times New Roman" w:cs="Times New Roman"/>
-                      <w:color w:val="auto"/>
-                      <w:sz w:val="24"/>
-                    </w:rPr>
-                    <w:t>Testar a importação de um arquivo corrompido e confirmar se o sistema exibe notificação de erro.</w:t>
-                  </w:r>
-                </w:p>
-                <w:p>
-                  <w:pPr>
-                    <w:pStyle w:val="PargrafodaLista"/>
-                    <w:numPr>
-                      <w:ilvl w:val="0"/>
-                      <w:numId w:val="10"/>
-                    </w:numPr>
-                    <w:spacing w:line="239" w:lineRule="auto"/>
-                    <w:jc w:val="both"/>
-                    <w:rPr>
-                      <w:rFonts w:ascii="Times New Roman" w:hAnsi="Times New Roman" w:cs="Times New Roman"/>
-                      <w:color w:val="auto"/>
-                      <w:sz w:val="24"/>
-                    </w:rPr>
-                  </w:pPr>
-                  <w:r>
-                    <w:rPr>
-                      <w:rFonts w:ascii="Times New Roman" w:hAnsi="Times New Roman" w:cs="Times New Roman"/>
-                      <w:color w:val="auto"/>
-                      <w:sz w:val="24"/>
-                    </w:rPr>
-                    <w:t>Conferir se as transações são categorizadas automaticamente quando possível.</w:t>
-                  </w:r>
-                </w:p>
-                <w:p>
-                  <w:pPr>
-                    <w:pStyle w:val="PargrafodaLista"/>
-                    <w:numPr>
-                      <w:ilvl w:val="0"/>
-                      <w:numId w:val="10"/>
-                    </w:numPr>
-                    <w:spacing w:line="239" w:lineRule="auto"/>
-                    <w:jc w:val="both"/>
-                    <w:rPr>
-                      <w:rFonts w:ascii="Times New Roman" w:hAnsi="Times New Roman" w:cs="Times New Roman"/>
-                      <w:color w:val="auto"/>
-                      <w:sz w:val="24"/>
-                    </w:rPr>
-                  </w:pPr>
-                  <w:r>
-                    <w:rPr>
-                      <w:rFonts w:ascii="Times New Roman" w:hAnsi="Times New Roman" w:cs="Times New Roman"/>
-                      <w:color w:val="auto"/>
-                      <w:sz w:val="24"/>
-                    </w:rPr>
-                    <w:t>Validar se o sistema notifica o usuário sobre transações que precisam de categorização manual.</w:t>
-                  </w:r>
-                </w:p>
-                <w:p>
-                  <w:pPr>
-                    <w:jc w:val="both"/>
-                    <w:rPr>
-                      <w:rFonts w:ascii="Times New Roman" w:hAnsi="Times New Roman" w:cs="Times New Roman"/>
-                      <w:sz w:val="24"/>
-                    </w:rPr>
-                  </w:pPr>
-                  <w:r>
-                    <w:rPr>
-                      <w:rFonts w:ascii="Times New Roman" w:eastAsia="Times New Roman" w:hAnsi="Times New Roman" w:cs="Times New Roman"/>
-                      <w:sz w:val="24"/>
-                    </w:rPr>
-                    <w:t xml:space="preserve">  </w:t>
-                  </w:r>
-                </w:p>
-                <w:p>
-                  <w:pPr>
-                    <w:jc w:val="both"/>
-                    <w:rPr>
-                      <w:rFonts w:ascii="Times New Roman" w:hAnsi="Times New Roman" w:cs="Times New Roman"/>
-                      <w:sz w:val="24"/>
-                    </w:rPr>
-                  </w:pPr>
-                  <w:r>
-                    <w:rPr>
-                      <w:rFonts w:ascii="Times New Roman" w:eastAsia="Times New Roman" w:hAnsi="Times New Roman" w:cs="Times New Roman"/>
-                      <w:sz w:val="24"/>
-                    </w:rPr>
-                    <w:t xml:space="preserve">  </w:t>
-                  </w:r>
-                  <w:r>
-                    <w:rPr>
-                      <w:rFonts w:ascii="Times New Roman" w:eastAsia="Times New Roman" w:hAnsi="Times New Roman" w:cs="Times New Roman"/>
-                      <w:b/>
-                      <w:sz w:val="24"/>
-                    </w:rPr>
-                    <w:t>Satisfação do cliente</w:t>
-                  </w:r>
-                  <w:r>
-                    <w:rPr>
-                      <w:rFonts w:ascii="Times New Roman" w:eastAsia="Times New Roman" w:hAnsi="Times New Roman" w:cs="Times New Roman"/>
-                      <w:sz w:val="24"/>
-                    </w:rPr>
-                    <w:t xml:space="preserve">: Alta </w:t>
-                  </w:r>
-                </w:p>
-                <w:p>
-                  <w:pPr>
-                    <w:jc w:val="both"/>
-                    <w:rPr>
-                      <w:rFonts w:ascii="Times New Roman" w:eastAsia="Times New Roman" w:hAnsi="Times New Roman" w:cs="Times New Roman"/>
-                      <w:color w:val="auto"/>
-                      <w:sz w:val="24"/>
-                    </w:rPr>
-                  </w:pPr>
-                  <w:r>
-                    <w:rPr>
-                      <w:rFonts w:ascii="Times New Roman" w:eastAsia="Times New Roman" w:hAnsi="Times New Roman" w:cs="Times New Roman"/>
-                      <w:color w:val="0000FF"/>
-                      <w:sz w:val="24"/>
-                    </w:rPr>
-                    <w:t xml:space="preserve">  </w:t>
-                  </w:r>
-                  <w:r>
-                    <w:rPr>
-                      <w:rFonts w:ascii="Times New Roman" w:eastAsia="Times New Roman" w:hAnsi="Times New Roman" w:cs="Times New Roman"/>
-                      <w:color w:val="auto"/>
-                      <w:sz w:val="24"/>
-                    </w:rPr>
-                    <w:t>(Usuário terá agilidade e segurança ao registrar suas movimentações financeiras, evitando retrabalho e inconsistências).</w:t>
-                  </w:r>
-                </w:p>
-                <w:p>
-                  <w:pPr>
-                    <w:jc w:val="both"/>
-                    <w:rPr>
-                      <w:rFonts w:ascii="Times New Roman" w:hAnsi="Times New Roman" w:cs="Times New Roman"/>
-                      <w:sz w:val="24"/>
-                    </w:rPr>
-                  </w:pPr>
-                </w:p>
-                <w:p>
-                  <w:pPr>
-                    <w:spacing w:after="1" w:line="238" w:lineRule="auto"/>
-                    <w:ind w:right="1831"/>
-                    <w:jc w:val="both"/>
-                    <w:rPr>
-                      <w:rFonts w:ascii="Times New Roman" w:hAnsi="Times New Roman" w:cs="Times New Roman"/>
-                      <w:color w:val="auto"/>
-                      <w:sz w:val="24"/>
-                    </w:rPr>
-                  </w:pPr>
-                  <w:r>
-                    <w:rPr>
-                      <w:rFonts w:ascii="Times New Roman" w:eastAsia="Times New Roman" w:hAnsi="Times New Roman" w:cs="Times New Roman"/>
-                      <w:b/>
-                      <w:sz w:val="24"/>
-                    </w:rPr>
-                    <w:t>Dependentes:</w:t>
-                  </w:r>
-                </w:p>
-                <w:p>
-                  <w:pPr>
-                    <w:pStyle w:val="PargrafodaLista"/>
-                    <w:spacing w:after="1" w:line="238" w:lineRule="auto"/>
-                    <w:jc w:val="both"/>
-                    <w:rPr>
-                      <w:rFonts w:ascii="Times New Roman" w:hAnsi="Times New Roman" w:cs="Times New Roman"/>
-                      <w:color w:val="auto"/>
-                      <w:sz w:val="24"/>
-                    </w:rPr>
-                  </w:pPr>
-                </w:p>
-                <w:p>
-                  <w:pPr>
-                    <w:pStyle w:val="PargrafodaLista"/>
-                    <w:numPr>
-                      <w:ilvl w:val="0"/>
-                      <w:numId w:val="12"/>
-                    </w:numPr>
-                    <w:spacing w:after="1" w:line="238" w:lineRule="auto"/>
-                    <w:ind w:right="1831"/>
-                    <w:jc w:val="both"/>
-                    <w:rPr>
-                      <w:rFonts w:ascii="Times New Roman" w:hAnsi="Times New Roman" w:cs="Times New Roman"/>
-                      <w:color w:val="auto"/>
-                      <w:sz w:val="24"/>
-                    </w:rPr>
-                  </w:pPr>
-                  <w:r>
-                    <w:rPr>
-                      <w:rFonts w:ascii="Times New Roman" w:hAnsi="Times New Roman" w:cs="Times New Roman"/>
-                      <w:color w:val="auto"/>
-                      <w:sz w:val="24"/>
-                    </w:rPr>
-                    <w:t>RF0</w:t>
-                  </w:r>
-                  <w:r>
-                    <w:rPr>
-                      <w:rFonts w:ascii="Times New Roman" w:hAnsi="Times New Roman" w:cs="Times New Roman"/>
-                      <w:color w:val="auto"/>
-                      <w:sz w:val="24"/>
-                    </w:rPr>
-                    <w:t>4</w:t>
-                  </w:r>
-                  <w:r>
-                    <w:rPr>
-                      <w:rFonts w:ascii="Times New Roman" w:hAnsi="Times New Roman" w:cs="Times New Roman"/>
-                      <w:color w:val="auto"/>
-                      <w:sz w:val="24"/>
-                    </w:rPr>
-                    <w:t xml:space="preserve"> (Gestão de Receitas e Despesas)</w:t>
-                  </w:r>
-                </w:p>
-                <w:p>
-                  <w:pPr>
-                    <w:pStyle w:val="PargrafodaLista"/>
-                    <w:numPr>
-                      <w:ilvl w:val="0"/>
-                      <w:numId w:val="12"/>
-                    </w:numPr>
-                    <w:spacing w:after="1" w:line="238" w:lineRule="auto"/>
-                    <w:ind w:right="1831"/>
-                    <w:jc w:val="both"/>
-                    <w:rPr>
-                      <w:rFonts w:ascii="Times New Roman" w:hAnsi="Times New Roman" w:cs="Times New Roman"/>
-                      <w:i/>
-                      <w:color w:val="auto"/>
-                      <w:sz w:val="24"/>
-                    </w:rPr>
-                  </w:pPr>
-                  <w:r>
-                    <w:rPr>
-                      <w:rFonts w:ascii="Times New Roman" w:hAnsi="Times New Roman" w:cs="Times New Roman"/>
-                      <w:color w:val="auto"/>
-                      <w:sz w:val="24"/>
-                    </w:rPr>
-                    <w:t>RF0</w:t>
-                  </w:r>
-                  <w:r>
-                    <w:rPr>
-                      <w:rFonts w:ascii="Times New Roman" w:hAnsi="Times New Roman" w:cs="Times New Roman"/>
-                      <w:color w:val="auto"/>
-                      <w:sz w:val="24"/>
-                    </w:rPr>
-                    <w:t>1</w:t>
-                  </w:r>
-                  <w:r>
-                    <w:rPr>
-                      <w:rFonts w:ascii="Times New Roman" w:hAnsi="Times New Roman" w:cs="Times New Roman"/>
-                      <w:color w:val="auto"/>
-                      <w:sz w:val="24"/>
-                    </w:rPr>
-                    <w:t xml:space="preserve"> (Controle de Contas Bancárias e Cartões)</w:t>
-                  </w:r>
-                </w:p>
-                <w:p>
-                  <w:pPr>
-                    <w:pStyle w:val="PargrafodaLista"/>
-                    <w:numPr>
-                      <w:ilvl w:val="0"/>
-                      <w:numId w:val="12"/>
-                    </w:numPr>
-                    <w:spacing w:after="1" w:line="238" w:lineRule="auto"/>
-                    <w:ind w:right="1831"/>
-                    <w:jc w:val="both"/>
-                    <w:rPr>
-                      <w:rFonts w:ascii="Times New Roman" w:hAnsi="Times New Roman" w:cs="Times New Roman"/>
-                      <w:i/>
-                      <w:color w:val="auto"/>
-                      <w:sz w:val="24"/>
-                    </w:rPr>
-                  </w:pPr>
-                  <w:r>
-                    <w:rPr>
-                      <w:rFonts w:ascii="Times New Roman" w:eastAsia="Times New Roman" w:hAnsi="Times New Roman" w:cs="Times New Roman"/>
-                      <w:bCs/>
-                      <w:sz w:val="23"/>
-                    </w:rPr>
-                    <w:t>RF0</w:t>
-                  </w:r>
-                  <w:r>
-                    <w:rPr>
-                      <w:rFonts w:ascii="Times New Roman" w:eastAsia="Times New Roman" w:hAnsi="Times New Roman" w:cs="Times New Roman"/>
-                      <w:bCs/>
-                      <w:sz w:val="23"/>
-                    </w:rPr>
-                    <w:t>5</w:t>
-                  </w:r>
-                  <w:r>
-                    <w:rPr>
-                      <w:rFonts w:ascii="Times New Roman" w:eastAsia="Times New Roman" w:hAnsi="Times New Roman" w:cs="Times New Roman"/>
-                      <w:bCs/>
-                      <w:sz w:val="23"/>
-                    </w:rPr>
-                    <w:t xml:space="preserve"> (</w:t>
-                  </w:r>
-                  <w:r>
-                    <w:rPr>
-                      <w:rFonts w:ascii="Times New Roman" w:eastAsia="Times New Roman" w:hAnsi="Times New Roman" w:cs="Times New Roman"/>
-                      <w:bCs/>
-                      <w:color w:val="1B1C1D"/>
-                      <w:sz w:val="24"/>
-                      <w:bdr w:val="none" w:sz="0" w:space="0" w:color="auto" w:frame="1"/>
-                    </w:rPr>
-                    <w:t>Login no Sistema)</w:t>
-                  </w:r>
-                </w:p>
-              </w:tc>
-            </w:tr>
-          </w:tbl>
-          <w:p>
-            <w:pPr>
-              <w:spacing w:after="1" w:line="238" w:lineRule="auto"/>
-              <w:ind w:right="1831"/>
-              <w:jc w:val="both"/>
-              <w:rPr>
-                <w:rFonts w:ascii="Times New Roman" w:eastAsia="Times New Roman" w:hAnsi="Times New Roman" w:cs="Times New Roman"/>
-                <w:i/>
-                <w:color w:val="auto"/>
-                <w:sz w:val="24"/>
-              </w:rPr>
-            </w:pPr>
-          </w:p>
-        </w:tc>
-      </w:tr>
-      <w:tr>
-        <w:tblPrEx>
-          <w:tblCellMar>
-            <w:top w:w="10" w:type="dxa"/>
-            <w:left w:w="68" w:type="dxa"/>
-            <w:right w:w="115" w:type="dxa"/>
-          </w:tblCellMar>
-        </w:tblPrEx>
         <w:trPr>
           <w:trHeight w:val="11321"/>
         </w:trPr>
@@ -4770,7 +3789,7 @@
                 <w:b/>
                 <w:sz w:val="24"/>
               </w:rPr>
-              <w:t>3</w:t>
+              <w:t>2</w:t>
             </w:r>
             <w:r>
               <w:rPr>
@@ -5325,7 +4344,7 @@
                 <w:color w:val="auto"/>
                 <w:sz w:val="24"/>
               </w:rPr>
-              <w:t>4</w:t>
+              <w:t>3</w:t>
             </w:r>
             <w:r>
               <w:rPr>
@@ -5408,7 +4427,7 @@
                 <w:bCs/>
                 <w:sz w:val="23"/>
               </w:rPr>
-              <w:t>5</w:t>
+              <w:t>4</w:t>
             </w:r>
             <w:r>
               <w:rPr>
@@ -5532,7 +4551,7 @@
                 <w:b/>
                 <w:sz w:val="24"/>
               </w:rPr>
-              <w:t>4</w:t>
+              <w:t>3</w:t>
             </w:r>
             <w:r>
               <w:rPr>
@@ -5740,20 +4759,6 @@
                 <w:sz w:val="24"/>
               </w:rPr>
               <w:t>Também será possível editar e excluir lançamentos existentes. Após cada registro ou alteração, o sistema apresentará confirmações visuais ou textuais.</w:t>
-            </w:r>
-            <w:r>
-              <w:rPr>
-                <w:rFonts w:ascii="Times New Roman" w:eastAsia="Times New Roman" w:hAnsi="Times New Roman" w:cs="Times New Roman"/>
-                <w:sz w:val="24"/>
-              </w:rPr>
-              <w:t xml:space="preserve"> </w:t>
-            </w:r>
-            <w:r>
-              <w:rPr>
-                <w:rFonts w:ascii="Times New Roman" w:eastAsia="Times New Roman" w:hAnsi="Times New Roman" w:cs="Times New Roman"/>
-                <w:sz w:val="24"/>
-              </w:rPr>
-              <w:t>As receitas e despesas poderão ainda ser registradas automaticamente a partir da importação de extrato bancário.</w:t>
             </w:r>
             <w:r>
               <w:rPr>
@@ -6112,22 +5117,6 @@
                 <w:sz w:val="24"/>
               </w:rPr>
             </w:pPr>
-            <w:r>
-              <w:rPr>
-                <w:rFonts w:ascii="Times New Roman" w:eastAsia="Times New Roman" w:hAnsi="Times New Roman" w:cs="Times New Roman"/>
-                <w:sz w:val="24"/>
-              </w:rPr>
-              <w:t>Confirmar que as receitas/despesas podem ser registradas via importação de extrato bancário.</w:t>
-            </w:r>
-          </w:p>
-          <w:p>
-            <w:pPr>
-              <w:jc w:val="both"/>
-              <w:rPr>
-                <w:rFonts w:ascii="Times New Roman" w:hAnsi="Times New Roman" w:cs="Times New Roman"/>
-                <w:sz w:val="24"/>
-              </w:rPr>
-            </w:pPr>
           </w:p>
           <w:p>
             <w:pPr>
@@ -6218,47 +5207,6 @@
                 <w:sz w:val="24"/>
               </w:rPr>
               <w:t xml:space="preserve">Requisitos Dependentes: </w:t>
-            </w:r>
-          </w:p>
-          <w:p>
-            <w:pPr>
-              <w:pStyle w:val="PargrafodaLista"/>
-              <w:numPr>
-                <w:ilvl w:val="0"/>
-                <w:numId w:val="12"/>
-              </w:numPr>
-              <w:spacing w:line="239" w:lineRule="auto"/>
-              <w:ind w:left="360" w:right="4325"/>
-              <w:jc w:val="both"/>
-              <w:rPr>
-                <w:rFonts w:ascii="Times New Roman" w:eastAsia="Times New Roman" w:hAnsi="Times New Roman" w:cs="Times New Roman"/>
-                <w:bCs/>
-                <w:sz w:val="24"/>
-              </w:rPr>
-            </w:pPr>
-            <w:r>
-              <w:rPr>
-                <w:rFonts w:ascii="Times New Roman" w:eastAsia="Times New Roman" w:hAnsi="Times New Roman" w:cs="Times New Roman"/>
-                <w:bCs/>
-                <w:sz w:val="24"/>
-              </w:rPr>
-              <w:t>RF0</w:t>
-            </w:r>
-            <w:r>
-              <w:rPr>
-                <w:rFonts w:ascii="Times New Roman" w:eastAsia="Times New Roman" w:hAnsi="Times New Roman" w:cs="Times New Roman"/>
-                <w:bCs/>
-                <w:sz w:val="24"/>
-              </w:rPr>
-              <w:t>2</w:t>
-            </w:r>
-            <w:r>
-              <w:rPr>
-                <w:rFonts w:ascii="Times New Roman" w:eastAsia="Times New Roman" w:hAnsi="Times New Roman" w:cs="Times New Roman"/>
-                <w:bCs/>
-                <w:sz w:val="24"/>
-              </w:rPr>
-              <w:t xml:space="preserve"> (Importação de Extrato Bancário)</w:t>
             </w:r>
           </w:p>
           <w:p>
@@ -6356,7 +5304,7 @@
                 <w:bCs/>
                 <w:sz w:val="23"/>
               </w:rPr>
-              <w:t>5</w:t>
+              <w:t>4</w:t>
             </w:r>
             <w:r>
               <w:rPr>
@@ -6455,7 +5403,7 @@
                 <w:b/>
                 <w:sz w:val="24"/>
               </w:rPr>
-              <w:t>5</w:t>
+              <w:t>4</w:t>
             </w:r>
             <w:r>
               <w:rPr>
@@ -6574,23 +5522,7 @@
                 <w:rFonts w:ascii="Times New Roman" w:eastAsia="Times New Roman" w:hAnsi="Times New Roman" w:cs="Times New Roman"/>
                 <w:sz w:val="24"/>
               </w:rPr>
-              <w:t xml:space="preserve">O usuário poderá realizar login no sistema </w:t>
-            </w:r>
-            <w:proofErr w:type="spellStart"/>
-            <w:r>
-              <w:rPr>
-                <w:rFonts w:ascii="Times New Roman" w:eastAsia="Times New Roman" w:hAnsi="Times New Roman" w:cs="Times New Roman"/>
-                <w:sz w:val="24"/>
-              </w:rPr>
-              <w:t>Monevo</w:t>
-            </w:r>
-            <w:proofErr w:type="spellEnd"/>
-            <w:r>
-              <w:rPr>
-                <w:rFonts w:ascii="Times New Roman" w:eastAsia="Times New Roman" w:hAnsi="Times New Roman" w:cs="Times New Roman"/>
-                <w:sz w:val="24"/>
-              </w:rPr>
-              <w:t xml:space="preserve"> utilizando suas credenciais cadastradas.</w:t>
+              <w:t>O usuário poderá realizar login no sistema Monevo utilizando suas credenciais cadastradas.</w:t>
             </w:r>
             <w:r>
               <w:rPr>
@@ -6998,7 +5930,7 @@
                 <w:color w:val="auto"/>
                 <w:sz w:val="24"/>
               </w:rPr>
-              <w:t>6</w:t>
+              <w:t>5</w:t>
             </w:r>
             <w:r>
               <w:rPr>
@@ -7050,7 +5982,7 @@
                 <w:rFonts w:ascii="Times New Roman" w:eastAsia="Times New Roman" w:hAnsi="Times New Roman" w:cs="Times New Roman"/>
                 <w:sz w:val="24"/>
               </w:rPr>
-              <w:t>7</w:t>
+              <w:t>6</w:t>
             </w:r>
             <w:r>
               <w:rPr>
@@ -7132,7 +6064,7 @@
                 <w:b/>
                 <w:sz w:val="24"/>
               </w:rPr>
-              <w:t>6</w:t>
+              <w:t>5</w:t>
             </w:r>
             <w:r>
               <w:rPr>
@@ -7296,23 +6228,7 @@
                 <w:rFonts w:ascii="Times New Roman" w:eastAsia="Times New Roman" w:hAnsi="Times New Roman" w:cs="Times New Roman"/>
                 <w:sz w:val="24"/>
               </w:rPr>
-              <w:t xml:space="preserve">, um </w:t>
-            </w:r>
-            <w:proofErr w:type="spellStart"/>
-            <w:r>
-              <w:rPr>
-                <w:rFonts w:ascii="Times New Roman" w:eastAsia="Times New Roman" w:hAnsi="Times New Roman" w:cs="Times New Roman"/>
-                <w:sz w:val="24"/>
-              </w:rPr>
-              <w:t>cpf</w:t>
-            </w:r>
-            <w:proofErr w:type="spellEnd"/>
-            <w:r>
-              <w:rPr>
-                <w:rFonts w:ascii="Times New Roman" w:eastAsia="Times New Roman" w:hAnsi="Times New Roman" w:cs="Times New Roman"/>
-                <w:sz w:val="24"/>
-              </w:rPr>
-              <w:t xml:space="preserve"> valido e um número de telefone</w:t>
+              <w:t>, um cpf valido e um número de telefone</w:t>
             </w:r>
             <w:r>
               <w:rPr>
@@ -7836,7 +6752,7 @@
                 <w:b/>
                 <w:sz w:val="24"/>
               </w:rPr>
-              <w:t>7</w:t>
+              <w:t>6</w:t>
             </w:r>
             <w:r>
               <w:rPr>
@@ -8339,7 +7255,7 @@
                 <w:color w:val="auto"/>
                 <w:sz w:val="24"/>
               </w:rPr>
-              <w:t>6</w:t>
+              <w:t>5</w:t>
             </w:r>
             <w:r>
               <w:rPr>
@@ -8487,7 +7403,7 @@
                 <w:b/>
                 <w:sz w:val="24"/>
               </w:rPr>
-              <w:t>8</w:t>
+              <w:t>7</w:t>
             </w:r>
             <w:r>
               <w:rPr>
@@ -8990,7 +7906,7 @@
                 <w:color w:val="auto"/>
                 <w:sz w:val="24"/>
               </w:rPr>
-              <w:t>5</w:t>
+              <w:t>4</w:t>
             </w:r>
             <w:r>
               <w:rPr>
@@ -9048,7 +7964,7 @@
                 <w:color w:val="auto"/>
                 <w:sz w:val="24"/>
               </w:rPr>
-              <w:t>6</w:t>
+              <w:t>5</w:t>
             </w:r>
             <w:r>
               <w:rPr>
@@ -9150,7 +8066,15 @@
                 <w:b/>
                 <w:sz w:val="24"/>
               </w:rPr>
-              <w:t>09</w:t>
+              <w:t>0</w:t>
+            </w:r>
+            <w:r>
+              <w:rPr>
+                <w:rFonts w:ascii="Times New Roman" w:eastAsia="Times New Roman" w:hAnsi="Times New Roman" w:cs="Times New Roman"/>
+                <w:b/>
+                <w:sz w:val="24"/>
+              </w:rPr>
+              <w:t>8</w:t>
             </w:r>
             <w:r>
               <w:rPr>
@@ -9699,12 +8623,11 @@
             </w:r>
             <w:r>
               <w:rPr>
-                <w:rFonts w:ascii="Times New Roman" w:eastAsia="Times New Roman" w:hAnsi="Times New Roman" w:cs="Times New Roman"/>
-                <w:color w:val="1B1C1D"/>
-                <w:sz w:val="24"/>
-                <w:bdr w:val="none" w:sz="0" w:space="0" w:color="auto" w:frame="1"/>
-              </w:rPr>
-              <w:t>Importação de Extrato Bancário</w:t>
+                <w:rFonts w:ascii="Times New Roman" w:hAnsi="Times New Roman" w:cs="Times New Roman"/>
+                <w:color w:val="auto"/>
+                <w:sz w:val="24"/>
+              </w:rPr>
+              <w:t>Projeção</w:t>
             </w:r>
             <w:r>
               <w:rPr>
@@ -9754,7 +8677,7 @@
                 <w:color w:val="auto"/>
                 <w:sz w:val="24"/>
               </w:rPr>
-              <w:t xml:space="preserve"> (</w:t>
+              <w:t xml:space="preserve"> (Controle de </w:t>
             </w:r>
             <w:r>
               <w:rPr>
@@ -9762,7 +8685,7 @@
                 <w:color w:val="auto"/>
                 <w:sz w:val="24"/>
               </w:rPr>
-              <w:t>Projeção</w:t>
+              <w:t>Despesa e Receita</w:t>
             </w:r>
             <w:r>
               <w:rPr>
@@ -9812,7 +8735,7 @@
                 <w:color w:val="auto"/>
                 <w:sz w:val="24"/>
               </w:rPr>
-              <w:t xml:space="preserve"> (Controle de </w:t>
+              <w:t xml:space="preserve"> (</w:t>
             </w:r>
             <w:r>
               <w:rPr>
@@ -9820,7 +8743,7 @@
                 <w:color w:val="auto"/>
                 <w:sz w:val="24"/>
               </w:rPr>
-              <w:t>Despesa e Receita</w:t>
+              <w:t>Login ao Sistema</w:t>
             </w:r>
             <w:r>
               <w:rPr>
@@ -9870,7 +8793,7 @@
                 <w:color w:val="auto"/>
                 <w:sz w:val="24"/>
               </w:rPr>
-              <w:t xml:space="preserve"> (</w:t>
+              <w:t xml:space="preserve"> (C</w:t>
             </w:r>
             <w:r>
               <w:rPr>
@@ -9878,7 +8801,7 @@
                 <w:color w:val="auto"/>
                 <w:sz w:val="24"/>
               </w:rPr>
-              <w:t>Login ao Sistema</w:t>
+              <w:t>adastro de conta de Usuário</w:t>
             </w:r>
             <w:r>
               <w:rPr>
@@ -9928,7 +8851,7 @@
                 <w:color w:val="auto"/>
                 <w:sz w:val="24"/>
               </w:rPr>
-              <w:t xml:space="preserve"> (C</w:t>
+              <w:t xml:space="preserve"> (</w:t>
             </w:r>
             <w:r>
               <w:rPr>
@@ -9936,7 +8859,7 @@
                 <w:color w:val="auto"/>
                 <w:sz w:val="24"/>
               </w:rPr>
-              <w:t>adastro de conta de Usuário</w:t>
+              <w:t>Alterar Senha</w:t>
             </w:r>
             <w:r>
               <w:rPr>
@@ -9967,69 +8890,29 @@
             <w:r>
               <w:rPr>
                 <w:rFonts w:ascii="Times New Roman" w:hAnsi="Times New Roman" w:cs="Times New Roman"/>
-                <w:color w:val="auto"/>
-                <w:sz w:val="24"/>
-              </w:rPr>
-              <w:t>RF0</w:t>
-            </w:r>
-            <w:r>
-              <w:rPr>
-                <w:rFonts w:ascii="Times New Roman" w:hAnsi="Times New Roman" w:cs="Times New Roman"/>
-                <w:color w:val="auto"/>
-                <w:sz w:val="24"/>
-              </w:rPr>
-              <w:t>7</w:t>
-            </w:r>
-            <w:r>
-              <w:rPr>
-                <w:rFonts w:ascii="Times New Roman" w:hAnsi="Times New Roman" w:cs="Times New Roman"/>
-                <w:color w:val="auto"/>
-                <w:sz w:val="24"/>
-              </w:rPr>
-              <w:t xml:space="preserve"> (</w:t>
-            </w:r>
-            <w:r>
-              <w:rPr>
-                <w:rFonts w:ascii="Times New Roman" w:hAnsi="Times New Roman" w:cs="Times New Roman"/>
-                <w:color w:val="auto"/>
-                <w:sz w:val="24"/>
-              </w:rPr>
-              <w:t>Alterar Senha</w:t>
-            </w:r>
-            <w:r>
-              <w:rPr>
-                <w:rFonts w:ascii="Times New Roman" w:hAnsi="Times New Roman" w:cs="Times New Roman"/>
-                <w:color w:val="auto"/>
-                <w:sz w:val="24"/>
-              </w:rPr>
-              <w:t>)</w:t>
-            </w:r>
-          </w:p>
-          <w:p>
-            <w:pPr>
-              <w:pStyle w:val="PargrafodaLista"/>
-              <w:numPr>
-                <w:ilvl w:val="0"/>
-                <w:numId w:val="41"/>
-              </w:numPr>
-              <w:spacing w:after="1" w:line="238" w:lineRule="auto"/>
-              <w:ind w:right="1831"/>
-              <w:jc w:val="both"/>
-              <w:rPr>
-                <w:rFonts w:ascii="Times New Roman" w:hAnsi="Times New Roman" w:cs="Times New Roman"/>
-                <w:i/>
-                <w:color w:val="auto"/>
-                <w:sz w:val="24"/>
-              </w:rPr>
-            </w:pPr>
-            <w:r>
-              <w:rPr>
-                <w:rFonts w:ascii="Times New Roman" w:hAnsi="Times New Roman" w:cs="Times New Roman"/>
                 <w:iCs/>
                 <w:color w:val="auto"/>
                 <w:sz w:val="24"/>
               </w:rPr>
-              <w:t>RF08(</w:t>
+              <w:t>RF0</w:t>
+            </w:r>
+            <w:r>
+              <w:rPr>
+                <w:rFonts w:ascii="Times New Roman" w:hAnsi="Times New Roman" w:cs="Times New Roman"/>
+                <w:iCs/>
+                <w:color w:val="auto"/>
+                <w:sz w:val="24"/>
+              </w:rPr>
+              <w:t xml:space="preserve">7 </w:t>
+            </w:r>
+            <w:r>
+              <w:rPr>
+                <w:rFonts w:ascii="Times New Roman" w:hAnsi="Times New Roman" w:cs="Times New Roman"/>
+                <w:iCs/>
+                <w:color w:val="auto"/>
+                <w:sz w:val="24"/>
+              </w:rPr>
+              <w:t>(</w:t>
             </w:r>
             <w:r>
               <w:rPr>
@@ -10365,27 +9248,7 @@
           <w:sz w:val="24"/>
           <w:bdr w:val="none" w:sz="0" w:space="0" w:color="auto" w:frame="1"/>
         </w:rPr>
-        <w:t xml:space="preserve"> As senhas dos usuários devem ser armazenadas no banco de dados utilizando algoritmo de </w:t>
-      </w:r>
-      <w:proofErr w:type="spellStart"/>
-      <w:r>
-        <w:rPr>
-          <w:rFonts w:ascii="Times New Roman" w:eastAsia="Times New Roman" w:hAnsi="Times New Roman" w:cs="Times New Roman"/>
-          <w:color w:val="1B1C1D"/>
-          <w:sz w:val="24"/>
-          <w:bdr w:val="none" w:sz="0" w:space="0" w:color="auto" w:frame="1"/>
-        </w:rPr>
-        <w:t>hash</w:t>
-      </w:r>
-      <w:proofErr w:type="spellEnd"/>
-      <w:r>
-        <w:rPr>
-          <w:rFonts w:ascii="Times New Roman" w:eastAsia="Times New Roman" w:hAnsi="Times New Roman" w:cs="Times New Roman"/>
-          <w:color w:val="1B1C1D"/>
-          <w:sz w:val="24"/>
-          <w:bdr w:val="none" w:sz="0" w:space="0" w:color="auto" w:frame="1"/>
-        </w:rPr>
-        <w:t xml:space="preserve"> seguro.</w:t>
+        <w:t xml:space="preserve"> As senhas dos usuários devem ser armazenadas no banco de dados utilizando algoritmo de hash seguro.</w:t>
       </w:r>
     </w:p>
     <w:p>
@@ -11287,25 +10150,6 @@
       </w:r>
       <w:r>
         <w:t xml:space="preserve"> telas para registro, edição e exclusão de receitas e despesas, com filtros por data, categoria e valor.</w:t>
-      </w:r>
-    </w:p>
-    <w:p>
-      <w:pPr>
-        <w:pStyle w:val="NormalWeb"/>
-        <w:numPr>
-          <w:ilvl w:val="0"/>
-          <w:numId w:val="27"/>
-        </w:numPr>
-        <w:jc w:val="both"/>
-      </w:pPr>
-      <w:r>
-        <w:rPr>
-          <w:rStyle w:val="Forte"/>
-        </w:rPr>
-        <w:t>Importação de Extratos:</w:t>
-      </w:r>
-      <w:r>
-        <w:t xml:space="preserve"> upload de arquivos OFX para integração automática de movimentações bancárias.</w:t>
       </w:r>
     </w:p>
     <w:p>

</xml_diff>